<commit_message>
Working Chapter 1 to 3
</commit_message>
<xml_diff>
--- a/interviews/SirDhan_Oct7.docx
+++ b/interviews/SirDhan_Oct7.docx
@@ -59,7 +59,12 @@
         <w:t xml:space="preserve"> you need this solution for this problem. Ang problema kase dito, meron kana agad na solution na nakaindicate, dapat wala muna, </w:t>
       </w:r>
       <w:r>
-        <w:t xml:space="preserve">Statement of the Problem nga or Background of the Study ang kinikwento niyo dito eh. So okay? Based sa analization niyo, base sa mga something, eto kase yung malaking problema and, </w:t>
+        <w:t xml:space="preserve">Statement of the Problem nga </w:t>
+      </w:r>
+      <w:bookmarkStart w:id="0" w:name="_GoBack"/>
+      <w:bookmarkEnd w:id="0"/>
+      <w:r>
+        <w:t xml:space="preserve">ang kinikwento niyo dito eh. So okay? Based sa analization niyo, base sa mga something, eto kase yung malaking problema and, </w:t>
       </w:r>
       <w:r>
         <w:t>etong mga nilagay niyo dito (sa SOP) based don sa malalaking problemang yon, nagcrcreate kayo ng Specific Problem, and yung mga Specific Problem nayon ay nasasag</w:t>
@@ -373,7 +378,7 @@
           <w:rFonts w:cs="Arial"/>
           <w:color w:val="191919"/>
         </w:rPr>
-        <w:t xml:space="preserve"> siya sa ibang </w:t>
+        <w:t xml:space="preserve"> siya sa ibang time, after 20 years, baka iba na yung technology, so pwede na magcreate ng another research na katulad nito pero </w:t>
       </w:r>
       <w:r>
         <w:rPr>
@@ -381,7 +386,7 @@
           <w:color w:val="191919"/>
         </w:rPr>
         <w:lastRenderedPageBreak/>
-        <w:t>time, after 20 years, baka iba na yung technology, so pwede na magcreate ng another research na katulad nito pero ibang timeline</w:t>
+        <w:t>ibang timeline</w:t>
       </w:r>
       <w:r>
         <w:rPr>
@@ -824,7 +829,14 @@
           <w:rFonts w:cs="Arial"/>
           <w:color w:val="191919"/>
         </w:rPr>
-        <w:t xml:space="preserve">gumawa kayo ng gantt chart, tapos requirements gathering, eto yung part nayon, sobrang haba, eh nagstart narin kayo ng development and </w:t>
+        <w:t>gumawa kayo ng gantt chart, tapos requirements gathering, eto yung part nayon, sobrang haba, eh nagstart narin kayo ng development and kinakaya naman pala so feasible talaga, matatapos niyo yung research in 1 year</w:t>
+      </w:r>
+      <w:r>
+        <w:rPr>
+          <w:rFonts w:cs="Arial"/>
+          <w:color w:val="191919"/>
+        </w:rPr>
+        <w:t xml:space="preserve"> span, yung Cost feasibility, nagcreate </w:t>
       </w:r>
       <w:r>
         <w:rPr>
@@ -832,14 +844,7 @@
           <w:color w:val="191919"/>
         </w:rPr>
         <w:lastRenderedPageBreak/>
-        <w:t>kinakaya naman pala so feasible talaga, matatapos niyo yung research in 1 year</w:t>
-      </w:r>
-      <w:r>
-        <w:rPr>
-          <w:rFonts w:cs="Arial"/>
-          <w:color w:val="191919"/>
-        </w:rPr>
-        <w:t xml:space="preserve"> span, yung Cost feasibility, nagcreate kayo ng Inline budget table, we can finish this with this cost and kaya naman namin ganon yung mga discussion don. </w:t>
+        <w:t xml:space="preserve">kayo ng Inline budget table, we can finish this with this cost and kaya naman namin ganon yung mga discussion don. </w:t>
       </w:r>
       <w:r>
         <w:rPr>
@@ -876,8 +881,6 @@
         </w:rPr>
         <w:t xml:space="preserve">ilagay po natin sa Appendices. </w:t>
       </w:r>
-      <w:bookmarkStart w:id="0" w:name="_GoBack"/>
-      <w:bookmarkEnd w:id="0"/>
     </w:p>
     <w:p>
       <w:pPr>
@@ -4743,6 +4746,7 @@
   <w:style w:type="character" w:default="1" w:styleId="DefaultParagraphFont">
     <w:name w:val="Default Paragraph Font"/>
     <w:uiPriority w:val="1"/>
+    <w:semiHidden/>
     <w:unhideWhenUsed/>
   </w:style>
   <w:style w:type="table" w:default="1" w:styleId="TableNormal">

</xml_diff>